<commit_message>
11v00: Dokumentation auf aktuellen Code-Stand gebracht
- Bedienungsanleitung: Display-Timeout + Display-Wake bei Alarm dokumentiert
- Changelog: neue Abschnitte 9v15-10v06 und 11v00 ergänzt
- Funktionsreferenz: Task-Beschreibungen aktualisiert, wakeDisplay()
  und markSafeChange() ergänzt
- UML-Diagramme entfernt (nicht mehr gepflegt)

Co-Authored-By: Claude Opus 4.7 <noreply@anthropic.com>
</commit_message>
<xml_diff>
--- a/Dokumentation/Bedienungsanleitung/bTn_Wecker_Bedienungsanleitung.docx
+++ b/Dokumentation/Bedienungsanleitung/bTn_Wecker_Bedienungsanleitung.docx
@@ -48,7 +48,7 @@
           <w:sz w:val="18"/>
           <w:szCs w:val="18"/>
         </w:rPr>
-        <w:t xml:space="preserve">Firmware 9v14  ·  ESP32 / FreeRTOS</w:t>
+        <w:t>Firmware 11v00  ·  ESP32 / FreeRTOS</w:t>
       </w:r>
     </w:p>
     <w:p>
@@ -1218,7 +1218,7 @@
           <w:sz w:val="20"/>
           <w:szCs w:val="20"/>
         </w:rPr>
-        <w:t xml:space="preserve">T0 wechselt die Seiten 0–6 zyklisch. S3 öffnet jederzeit die Info-Seite (Seite 7). Nach 20 Sekunden ohne Eingabe kehrt das Gerät automatisch zu Seite 0 zurück – auch von der Info-Seite.</w:t>
+        <w:t>T0 wechselt die Seiten 0–6 zyklisch. S3 öffnet jederzeit die Info-Seite (Seite 7). Nach 20 Sekunden ohne Eingabe kehrt das Gerät automatisch zu Seite 0 zurück – auch von der Info-Seite. Nach weiteren 5 Minuten ohne Touch-Eingabe schaltet das OLED-Display ab; eine Berührung eines beliebigen Touch-Felds schaltet es wieder ein (das auslösende Touch-Event wird dabei verworfen).</w:t>
       </w:r>
     </w:p>
     <w:p>
@@ -2507,6 +2507,67 @@
           </w:p>
         </w:tc>
       </w:tr>
+      <w:tr>
+        <w:tc>
+          <w:tcPr>
+            <w:tcW w:type="dxa" w:w="2400"/>
+            <w:tcBorders>
+              <w:top w:val="single" w:color="CCCCCC" w:sz="1"/>
+              <w:left w:val="single" w:color="CCCCCC" w:sz="1"/>
+              <w:bottom w:val="single" w:color="CCCCCC" w:sz="1"/>
+              <w:right w:val="single" w:color="CCCCCC" w:sz="1"/>
+            </w:tcBorders>
+            <w:shd w:fill="D6E4F0" w:val="clear"/>
+            <w:tcMar>
+              <w:top w:type="dxa" w:w="70"/>
+              <w:left w:type="dxa" w:w="110"/>
+              <w:bottom w:type="dxa" w:w="70"/>
+              <w:right w:type="dxa" w:w="110"/>
+            </w:tcMar>
+          </w:tcPr>
+          <w:p>
+            <w:r>
+              <w:rPr>
+                <w:rFonts w:ascii="Arial" w:cs="Arial" w:eastAsia="Arial" w:hAnsi="Arial"/>
+                <w:b/>
+                <w:bCs/>
+                <w:color w:val="1F4E79"/>
+                <w:sz w:val="19"/>
+                <w:szCs w:val="19"/>
+              </w:rPr>
+              <w:t>Display-Wake</w:t>
+            </w:r>
+          </w:p>
+        </w:tc>
+        <w:tc>
+          <w:tcPr>
+            <w:tcW w:type="dxa" w:w="6626"/>
+            <w:tcBorders>
+              <w:top w:val="single" w:color="CCCCCC" w:sz="1"/>
+              <w:left w:val="single" w:color="CCCCCC" w:sz="1"/>
+              <w:bottom w:val="single" w:color="CCCCCC" w:sz="1"/>
+              <w:right w:val="single" w:color="CCCCCC" w:sz="1"/>
+            </w:tcBorders>
+            <w:shd w:fill="FFFFFF" w:val="clear"/>
+            <w:tcMar>
+              <w:top w:type="dxa" w:w="70"/>
+              <w:left w:type="dxa" w:w="110"/>
+              <w:bottom w:type="dxa" w:w="70"/>
+              <w:right w:type="dxa" w:w="110"/>
+            </w:tcMar>
+          </w:tcPr>
+          <w:p>
+            <w:r>
+              <w:rPr>
+                <w:rFonts w:ascii="Arial" w:cs="Arial" w:eastAsia="Arial" w:hAnsi="Arial"/>
+                <w:sz w:val="19"/>
+                <w:szCs w:val="19"/>
+              </w:rPr>
+              <w:t>OLED wird beim Alarm-Start automatisch eingeschaltet, falls es zuvor nach 5 Minuten Ruhezeit abgeschaltet wurde</w:t>
+            </w:r>
+          </w:p>
+        </w:tc>
+      </w:tr>
     </w:tbl>
     <w:p>
       <w:pPr>
@@ -4671,7 +4732,7 @@
           <w:sz w:val="16"/>
           <w:szCs w:val="16"/>
         </w:rPr>
-        <w:t xml:space="preserve">bTn Wecker  ·  Bedienungsanleitung  ·  Firmware 9v14</w:t>
+        <w:t>bTn Wecker  ·  Bedienungsanleitung  ·  Firmware 11v00</w:t>
       </w:r>
     </w:p>
     <w:sectPr>

</xml_diff>